<commit_message>
Import A/B/C/E AI-assisted review as a separate verification-adjusted sensitivity layer (D excluded)
Frozen mechanical results, sealed blind outcome and primary adjudication are unchanged.
Adds validated import, frozen-vs-adjusted funnel/estimands, manuscript/supplement
section and Tables 6-9, WITHOUT_D_STATUS.md and a generated QC report.

Co-Authored-By: Tatsuki Onishi <bougtoir@gmail.com>
</commit_message>
<xml_diff>
--- a/paper2_reconstruction/manuscript/Editable_tables_EN.docx
+++ b/paper2_reconstruction/manuscript/Editable_tables_EN.docx
@@ -5641,6 +5641,1543 @@
         <w:rPr>
           <w:i/>
         </w:rPr>
+        <w:t>Table 6. Paper-level successful-slot distribution among 10 attempted papers: frozen mechanical versus verification-adjusted (AI-assisted review, provisional).</w:t>
+      </w:r>
+    </w:p>
+    <w:tbl>
+      <w:tblPr>
+        <w:tblStyle w:val="TableGrid"/>
+        <w:tblW w:type="auto" w:w="0"/>
+        <w:tblLook w:firstColumn="1" w:firstRow="1" w:lastColumn="0" w:lastRow="0" w:noHBand="0" w:noVBand="1" w:val="04A0"/>
+      </w:tblPr>
+      <w:tblGrid>
+        <w:gridCol w:w="3360"/>
+        <w:gridCol w:w="3360"/>
+        <w:gridCol w:w="3360"/>
+      </w:tblGrid>
+      <w:tr>
+        <w:tc>
+          <w:tcPr>
+            <w:tcW w:type="dxa" w:w="3360"/>
+          </w:tcPr>
+          <w:p>
+            <w:pPr>
+              <w:keepNext/>
+            </w:pPr>
+            <w:r>
+              <w:rPr>
+                <w:sz w:val="18"/>
+              </w:rPr>
+              <w:t>Successful slots</w:t>
+            </w:r>
+          </w:p>
+        </w:tc>
+        <w:tc>
+          <w:tcPr>
+            <w:tcW w:type="dxa" w:w="3360"/>
+          </w:tcPr>
+          <w:p>
+            <w:pPr>
+              <w:keepNext/>
+            </w:pPr>
+            <w:r>
+              <w:rPr>
+                <w:sz w:val="18"/>
+              </w:rPr>
+              <w:t>Frozen papers</w:t>
+            </w:r>
+          </w:p>
+        </w:tc>
+        <w:tc>
+          <w:tcPr>
+            <w:tcW w:type="dxa" w:w="3360"/>
+          </w:tcPr>
+          <w:p>
+            <w:pPr>
+              <w:keepNext/>
+            </w:pPr>
+            <w:r>
+              <w:rPr>
+                <w:sz w:val="18"/>
+              </w:rPr>
+              <w:t>Adjusted papers</w:t>
+            </w:r>
+          </w:p>
+        </w:tc>
+      </w:tr>
+      <w:tr>
+        <w:tc>
+          <w:tcPr>
+            <w:tcW w:type="dxa" w:w="3360"/>
+          </w:tcPr>
+          <w:p>
+            <w:pPr>
+              <w:keepNext/>
+            </w:pPr>
+            <w:r>
+              <w:rPr>
+                <w:sz w:val="18"/>
+              </w:rPr>
+              <w:t>0/3</w:t>
+            </w:r>
+          </w:p>
+        </w:tc>
+        <w:tc>
+          <w:tcPr>
+            <w:tcW w:type="dxa" w:w="3360"/>
+          </w:tcPr>
+          <w:p>
+            <w:pPr>
+              <w:keepNext/>
+            </w:pPr>
+            <w:r>
+              <w:rPr>
+                <w:sz w:val="18"/>
+              </w:rPr>
+              <w:t>9</w:t>
+            </w:r>
+          </w:p>
+        </w:tc>
+        <w:tc>
+          <w:tcPr>
+            <w:tcW w:type="dxa" w:w="3360"/>
+          </w:tcPr>
+          <w:p>
+            <w:pPr>
+              <w:keepNext/>
+            </w:pPr>
+            <w:r>
+              <w:rPr>
+                <w:sz w:val="18"/>
+              </w:rPr>
+              <w:t>9</w:t>
+            </w:r>
+          </w:p>
+        </w:tc>
+      </w:tr>
+      <w:tr>
+        <w:tc>
+          <w:tcPr>
+            <w:tcW w:type="dxa" w:w="3360"/>
+          </w:tcPr>
+          <w:p>
+            <w:pPr>
+              <w:keepNext/>
+            </w:pPr>
+            <w:r>
+              <w:rPr>
+                <w:sz w:val="18"/>
+              </w:rPr>
+              <w:t>1/3</w:t>
+            </w:r>
+          </w:p>
+        </w:tc>
+        <w:tc>
+          <w:tcPr>
+            <w:tcW w:type="dxa" w:w="3360"/>
+          </w:tcPr>
+          <w:p>
+            <w:pPr>
+              <w:keepNext/>
+            </w:pPr>
+            <w:r>
+              <w:rPr>
+                <w:sz w:val="18"/>
+              </w:rPr>
+              <w:t>1</w:t>
+            </w:r>
+          </w:p>
+        </w:tc>
+        <w:tc>
+          <w:tcPr>
+            <w:tcW w:type="dxa" w:w="3360"/>
+          </w:tcPr>
+          <w:p>
+            <w:pPr>
+              <w:keepNext/>
+            </w:pPr>
+            <w:r>
+              <w:rPr>
+                <w:sz w:val="18"/>
+              </w:rPr>
+              <w:t>0</w:t>
+            </w:r>
+          </w:p>
+        </w:tc>
+      </w:tr>
+      <w:tr>
+        <w:tc>
+          <w:tcPr>
+            <w:tcW w:type="dxa" w:w="3360"/>
+          </w:tcPr>
+          <w:p>
+            <w:pPr>
+              <w:keepNext/>
+            </w:pPr>
+            <w:r>
+              <w:rPr>
+                <w:sz w:val="18"/>
+              </w:rPr>
+              <w:t>2/3</w:t>
+            </w:r>
+          </w:p>
+        </w:tc>
+        <w:tc>
+          <w:tcPr>
+            <w:tcW w:type="dxa" w:w="3360"/>
+          </w:tcPr>
+          <w:p>
+            <w:pPr>
+              <w:keepNext/>
+            </w:pPr>
+            <w:r>
+              <w:rPr>
+                <w:sz w:val="18"/>
+              </w:rPr>
+              <w:t>0</w:t>
+            </w:r>
+          </w:p>
+        </w:tc>
+        <w:tc>
+          <w:tcPr>
+            <w:tcW w:type="dxa" w:w="3360"/>
+          </w:tcPr>
+          <w:p>
+            <w:pPr>
+              <w:keepNext/>
+            </w:pPr>
+            <w:r>
+              <w:rPr>
+                <w:sz w:val="18"/>
+              </w:rPr>
+              <w:t>1</w:t>
+            </w:r>
+          </w:p>
+        </w:tc>
+      </w:tr>
+      <w:tr>
+        <w:tc>
+          <w:tcPr>
+            <w:tcW w:type="dxa" w:w="3360"/>
+          </w:tcPr>
+          <w:p>
+            <w:pPr>
+              <w:keepNext w:val="0"/>
+            </w:pPr>
+            <w:r>
+              <w:rPr>
+                <w:sz w:val="18"/>
+              </w:rPr>
+              <w:t>3/3</w:t>
+            </w:r>
+          </w:p>
+        </w:tc>
+        <w:tc>
+          <w:tcPr>
+            <w:tcW w:type="dxa" w:w="3360"/>
+          </w:tcPr>
+          <w:p>
+            <w:pPr>
+              <w:keepNext w:val="0"/>
+            </w:pPr>
+            <w:r>
+              <w:rPr>
+                <w:sz w:val="18"/>
+              </w:rPr>
+              <w:t>0</w:t>
+            </w:r>
+          </w:p>
+        </w:tc>
+        <w:tc>
+          <w:tcPr>
+            <w:tcW w:type="dxa" w:w="3360"/>
+          </w:tcPr>
+          <w:p>
+            <w:pPr>
+              <w:keepNext w:val="0"/>
+            </w:pPr>
+            <w:r>
+              <w:rPr>
+                <w:sz w:val="18"/>
+              </w:rPr>
+              <w:t>0</w:t>
+            </w:r>
+          </w:p>
+        </w:tc>
+      </w:tr>
+    </w:tbl>
+    <w:p>
+      <w:pPr>
+        <w:keepNext/>
+        <w:spacing w:before="280" w:after="160"/>
+      </w:pPr>
+      <w:r>
+        <w:rPr>
+          <w:i/>
+        </w:rPr>
+        <w:t>Table 7. 100-paper funnel by state: frozen record, verification-adjusted state and unresolved envelope (no reclassified paper was executed).</w:t>
+      </w:r>
+    </w:p>
+    <w:tbl>
+      <w:tblPr>
+        <w:tblStyle w:val="TableGrid"/>
+        <w:tblW w:type="auto" w:w="0"/>
+        <w:tblLook w:firstColumn="1" w:firstRow="1" w:lastColumn="0" w:lastRow="0" w:noHBand="0" w:noVBand="1" w:val="04A0"/>
+      </w:tblPr>
+      <w:tblGrid>
+        <w:gridCol w:w="2520"/>
+        <w:gridCol w:w="2520"/>
+        <w:gridCol w:w="2520"/>
+        <w:gridCol w:w="2520"/>
+      </w:tblGrid>
+      <w:tr>
+        <w:tc>
+          <w:tcPr>
+            <w:tcW w:type="dxa" w:w="2520"/>
+          </w:tcPr>
+          <w:p>
+            <w:pPr>
+              <w:keepNext/>
+            </w:pPr>
+            <w:r>
+              <w:rPr>
+                <w:sz w:val="18"/>
+              </w:rPr>
+              <w:t>State</w:t>
+            </w:r>
+          </w:p>
+        </w:tc>
+        <w:tc>
+          <w:tcPr>
+            <w:tcW w:type="dxa" w:w="2520"/>
+          </w:tcPr>
+          <w:p>
+            <w:pPr>
+              <w:keepNext/>
+            </w:pPr>
+            <w:r>
+              <w:rPr>
+                <w:sz w:val="18"/>
+              </w:rPr>
+              <w:t>Frozen</w:t>
+            </w:r>
+          </w:p>
+        </w:tc>
+        <w:tc>
+          <w:tcPr>
+            <w:tcW w:type="dxa" w:w="2520"/>
+          </w:tcPr>
+          <w:p>
+            <w:pPr>
+              <w:keepNext/>
+            </w:pPr>
+            <w:r>
+              <w:rPr>
+                <w:sz w:val="18"/>
+              </w:rPr>
+              <w:t>Adjusted</w:t>
+            </w:r>
+          </w:p>
+        </w:tc>
+        <w:tc>
+          <w:tcPr>
+            <w:tcW w:type="dxa" w:w="2520"/>
+          </w:tcPr>
+          <w:p>
+            <w:pPr>
+              <w:keepNext/>
+            </w:pPr>
+            <w:r>
+              <w:rPr>
+                <w:sz w:val="18"/>
+              </w:rPr>
+              <w:t>Envelope</w:t>
+            </w:r>
+          </w:p>
+        </w:tc>
+      </w:tr>
+      <w:tr>
+        <w:tc>
+          <w:tcPr>
+            <w:tcW w:type="dxa" w:w="2520"/>
+          </w:tcPr>
+          <w:p>
+            <w:pPr>
+              <w:keepNext/>
+            </w:pPr>
+            <w:r>
+              <w:rPr>
+                <w:sz w:val="18"/>
+              </w:rPr>
+              <w:t>all inputs leak target</w:t>
+            </w:r>
+          </w:p>
+        </w:tc>
+        <w:tc>
+          <w:tcPr>
+            <w:tcW w:type="dxa" w:w="2520"/>
+          </w:tcPr>
+          <w:p>
+            <w:pPr>
+              <w:keepNext/>
+            </w:pPr>
+            <w:r>
+              <w:rPr>
+                <w:sz w:val="18"/>
+              </w:rPr>
+              <w:t>10</w:t>
+            </w:r>
+          </w:p>
+        </w:tc>
+        <w:tc>
+          <w:tcPr>
+            <w:tcW w:type="dxa" w:w="2520"/>
+          </w:tcPr>
+          <w:p>
+            <w:pPr>
+              <w:keepNext/>
+            </w:pPr>
+            <w:r>
+              <w:rPr>
+                <w:sz w:val="18"/>
+              </w:rPr>
+              <w:t>1</w:t>
+            </w:r>
+          </w:p>
+        </w:tc>
+        <w:tc>
+          <w:tcPr>
+            <w:tcW w:type="dxa" w:w="2520"/>
+          </w:tcPr>
+          <w:p>
+            <w:pPr>
+              <w:keepNext/>
+            </w:pPr>
+            <w:r>
+              <w:rPr>
+                <w:sz w:val="18"/>
+              </w:rPr>
+              <w:t>1</w:t>
+            </w:r>
+          </w:p>
+        </w:tc>
+      </w:tr>
+      <w:tr>
+        <w:tc>
+          <w:tcPr>
+            <w:tcW w:type="dxa" w:w="2520"/>
+          </w:tcPr>
+          <w:p>
+            <w:pPr>
+              <w:keepNext/>
+            </w:pPr>
+            <w:r>
+              <w:rPr>
+                <w:sz w:val="18"/>
+              </w:rPr>
+              <w:t>external reference resource required not served</w:t>
+            </w:r>
+          </w:p>
+        </w:tc>
+        <w:tc>
+          <w:tcPr>
+            <w:tcW w:type="dxa" w:w="2520"/>
+          </w:tcPr>
+          <w:p>
+            <w:pPr>
+              <w:keepNext/>
+            </w:pPr>
+            <w:r>
+              <w:rPr>
+                <w:sz w:val="18"/>
+              </w:rPr>
+              <w:t>28</w:t>
+            </w:r>
+          </w:p>
+        </w:tc>
+        <w:tc>
+          <w:tcPr>
+            <w:tcW w:type="dxa" w:w="2520"/>
+          </w:tcPr>
+          <w:p>
+            <w:pPr>
+              <w:keepNext/>
+            </w:pPr>
+            <w:r>
+              <w:rPr>
+                <w:sz w:val="18"/>
+              </w:rPr>
+              <w:t>28</w:t>
+            </w:r>
+          </w:p>
+        </w:tc>
+        <w:tc>
+          <w:tcPr>
+            <w:tcW w:type="dxa" w:w="2520"/>
+          </w:tcPr>
+          <w:p>
+            <w:pPr>
+              <w:keepNext/>
+            </w:pPr>
+            <w:r>
+              <w:rPr>
+                <w:sz w:val="18"/>
+              </w:rPr>
+              <w:t>28</w:t>
+            </w:r>
+          </w:p>
+        </w:tc>
+      </w:tr>
+      <w:tr>
+        <w:tc>
+          <w:tcPr>
+            <w:tcW w:type="dxa" w:w="2520"/>
+          </w:tcPr>
+          <w:p>
+            <w:pPr>
+              <w:keepNext/>
+            </w:pPr>
+            <w:r>
+              <w:rPr>
+                <w:sz w:val="18"/>
+              </w:rPr>
+              <w:t>gate failed delegated</w:t>
+            </w:r>
+          </w:p>
+        </w:tc>
+        <w:tc>
+          <w:tcPr>
+            <w:tcW w:type="dxa" w:w="2520"/>
+          </w:tcPr>
+          <w:p>
+            <w:pPr>
+              <w:keepNext/>
+            </w:pPr>
+            <w:r>
+              <w:rPr>
+                <w:sz w:val="18"/>
+              </w:rPr>
+              <w:t>24</w:t>
+            </w:r>
+          </w:p>
+        </w:tc>
+        <w:tc>
+          <w:tcPr>
+            <w:tcW w:type="dxa" w:w="2520"/>
+          </w:tcPr>
+          <w:p>
+            <w:pPr>
+              <w:keepNext/>
+            </w:pPr>
+            <w:r>
+              <w:rPr>
+                <w:sz w:val="18"/>
+              </w:rPr>
+              <w:t>25</w:t>
+            </w:r>
+          </w:p>
+        </w:tc>
+        <w:tc>
+          <w:tcPr>
+            <w:tcW w:type="dxa" w:w="2520"/>
+          </w:tcPr>
+          <w:p>
+            <w:pPr>
+              <w:keepNext/>
+            </w:pPr>
+            <w:r>
+              <w:rPr>
+                <w:sz w:val="18"/>
+              </w:rPr>
+              <w:t>24</w:t>
+            </w:r>
+          </w:p>
+        </w:tc>
+      </w:tr>
+      <w:tr>
+        <w:tc>
+          <w:tcPr>
+            <w:tcW w:type="dxa" w:w="2520"/>
+          </w:tcPr>
+          <w:p>
+            <w:pPr>
+              <w:keepNext/>
+            </w:pPr>
+            <w:r>
+              <w:rPr>
+                <w:sz w:val="18"/>
+              </w:rPr>
+              <w:t>no input retained</w:t>
+            </w:r>
+          </w:p>
+        </w:tc>
+        <w:tc>
+          <w:tcPr>
+            <w:tcW w:type="dxa" w:w="2520"/>
+          </w:tcPr>
+          <w:p>
+            <w:pPr>
+              <w:keepNext/>
+            </w:pPr>
+            <w:r>
+              <w:rPr>
+                <w:sz w:val="18"/>
+              </w:rPr>
+              <w:t>1</w:t>
+            </w:r>
+          </w:p>
+        </w:tc>
+        <w:tc>
+          <w:tcPr>
+            <w:tcW w:type="dxa" w:w="2520"/>
+          </w:tcPr>
+          <w:p>
+            <w:pPr>
+              <w:keepNext/>
+            </w:pPr>
+            <w:r>
+              <w:rPr>
+                <w:sz w:val="18"/>
+              </w:rPr>
+              <w:t>1</w:t>
+            </w:r>
+          </w:p>
+        </w:tc>
+        <w:tc>
+          <w:tcPr>
+            <w:tcW w:type="dxa" w:w="2520"/>
+          </w:tcPr>
+          <w:p>
+            <w:pPr>
+              <w:keepNext/>
+            </w:pPr>
+            <w:r>
+              <w:rPr>
+                <w:sz w:val="18"/>
+              </w:rPr>
+              <w:t>1</w:t>
+            </w:r>
+          </w:p>
+        </w:tc>
+      </w:tr>
+      <w:tr>
+        <w:tc>
+          <w:tcPr>
+            <w:tcW w:type="dxa" w:w="2520"/>
+          </w:tcPr>
+          <w:p>
+            <w:pPr>
+              <w:keepNext/>
+            </w:pPr>
+            <w:r>
+              <w:rPr>
+                <w:sz w:val="18"/>
+              </w:rPr>
+              <w:t>required inputs not in public listing</w:t>
+            </w:r>
+          </w:p>
+        </w:tc>
+        <w:tc>
+          <w:tcPr>
+            <w:tcW w:type="dxa" w:w="2520"/>
+          </w:tcPr>
+          <w:p>
+            <w:pPr>
+              <w:keepNext/>
+            </w:pPr>
+            <w:r>
+              <w:rPr>
+                <w:sz w:val="18"/>
+              </w:rPr>
+              <w:t>16</w:t>
+            </w:r>
+          </w:p>
+        </w:tc>
+        <w:tc>
+          <w:tcPr>
+            <w:tcW w:type="dxa" w:w="2520"/>
+          </w:tcPr>
+          <w:p>
+            <w:pPr>
+              <w:keepNext/>
+            </w:pPr>
+            <w:r>
+              <w:rPr>
+                <w:sz w:val="18"/>
+              </w:rPr>
+              <w:t>17</w:t>
+            </w:r>
+          </w:p>
+        </w:tc>
+        <w:tc>
+          <w:tcPr>
+            <w:tcW w:type="dxa" w:w="2520"/>
+          </w:tcPr>
+          <w:p>
+            <w:pPr>
+              <w:keepNext/>
+            </w:pPr>
+            <w:r>
+              <w:rPr>
+                <w:sz w:val="18"/>
+              </w:rPr>
+              <w:t>16</w:t>
+            </w:r>
+          </w:p>
+        </w:tc>
+      </w:tr>
+      <w:tr>
+        <w:tc>
+          <w:tcPr>
+            <w:tcW w:type="dxa" w:w="2520"/>
+          </w:tcPr>
+          <w:p>
+            <w:pPr>
+              <w:keepNext/>
+            </w:pPr>
+            <w:r>
+              <w:rPr>
+                <w:sz w:val="18"/>
+              </w:rPr>
+              <w:t>slots completed</w:t>
+            </w:r>
+          </w:p>
+        </w:tc>
+        <w:tc>
+          <w:tcPr>
+            <w:tcW w:type="dxa" w:w="2520"/>
+          </w:tcPr>
+          <w:p>
+            <w:pPr>
+              <w:keepNext/>
+            </w:pPr>
+            <w:r>
+              <w:rPr>
+                <w:sz w:val="18"/>
+              </w:rPr>
+              <w:t>10</w:t>
+            </w:r>
+          </w:p>
+        </w:tc>
+        <w:tc>
+          <w:tcPr>
+            <w:tcW w:type="dxa" w:w="2520"/>
+          </w:tcPr>
+          <w:p>
+            <w:pPr>
+              <w:keepNext/>
+            </w:pPr>
+            <w:r>
+              <w:rPr>
+                <w:sz w:val="18"/>
+              </w:rPr>
+              <w:t>10</w:t>
+            </w:r>
+          </w:p>
+        </w:tc>
+        <w:tc>
+          <w:tcPr>
+            <w:tcW w:type="dxa" w:w="2520"/>
+          </w:tcPr>
+          <w:p>
+            <w:pPr>
+              <w:keepNext/>
+            </w:pPr>
+            <w:r>
+              <w:rPr>
+                <w:sz w:val="18"/>
+              </w:rPr>
+              <w:t>10</w:t>
+            </w:r>
+          </w:p>
+        </w:tc>
+      </w:tr>
+      <w:tr>
+        <w:tc>
+          <w:tcPr>
+            <w:tcW w:type="dxa" w:w="2520"/>
+          </w:tcPr>
+          <w:p>
+            <w:pPr>
+              <w:keepNext/>
+            </w:pPr>
+            <w:r>
+              <w:rPr>
+                <w:sz w:val="18"/>
+              </w:rPr>
+              <w:t>specifiable runnable</w:t>
+            </w:r>
+          </w:p>
+        </w:tc>
+        <w:tc>
+          <w:tcPr>
+            <w:tcW w:type="dxa" w:w="2520"/>
+          </w:tcPr>
+          <w:p>
+            <w:pPr>
+              <w:keepNext/>
+            </w:pPr>
+            <w:r>
+              <w:rPr>
+                <w:sz w:val="18"/>
+              </w:rPr>
+              <w:t>0</w:t>
+            </w:r>
+          </w:p>
+        </w:tc>
+        <w:tc>
+          <w:tcPr>
+            <w:tcW w:type="dxa" w:w="2520"/>
+          </w:tcPr>
+          <w:p>
+            <w:pPr>
+              <w:keepNext/>
+            </w:pPr>
+            <w:r>
+              <w:rPr>
+                <w:sz w:val="18"/>
+              </w:rPr>
+              <w:t>5</w:t>
+            </w:r>
+          </w:p>
+        </w:tc>
+        <w:tc>
+          <w:tcPr>
+            <w:tcW w:type="dxa" w:w="2520"/>
+          </w:tcPr>
+          <w:p>
+            <w:pPr>
+              <w:keepNext/>
+            </w:pPr>
+            <w:r>
+              <w:rPr>
+                <w:sz w:val="18"/>
+              </w:rPr>
+              <w:t>0</w:t>
+            </w:r>
+          </w:p>
+        </w:tc>
+      </w:tr>
+      <w:tr>
+        <w:tc>
+          <w:tcPr>
+            <w:tcW w:type="dxa" w:w="2520"/>
+          </w:tcPr>
+          <w:p>
+            <w:pPr>
+              <w:keepNext/>
+            </w:pPr>
+            <w:r>
+              <w:rPr>
+                <w:sz w:val="18"/>
+              </w:rPr>
+              <w:t>specification not obtained</w:t>
+            </w:r>
+          </w:p>
+        </w:tc>
+        <w:tc>
+          <w:tcPr>
+            <w:tcW w:type="dxa" w:w="2520"/>
+          </w:tcPr>
+          <w:p>
+            <w:pPr>
+              <w:keepNext/>
+            </w:pPr>
+            <w:r>
+              <w:rPr>
+                <w:sz w:val="18"/>
+              </w:rPr>
+              <w:t>7</w:t>
+            </w:r>
+          </w:p>
+        </w:tc>
+        <w:tc>
+          <w:tcPr>
+            <w:tcW w:type="dxa" w:w="2520"/>
+          </w:tcPr>
+          <w:p>
+            <w:pPr>
+              <w:keepNext/>
+            </w:pPr>
+            <w:r>
+              <w:rPr>
+                <w:sz w:val="18"/>
+              </w:rPr>
+              <w:t>7</w:t>
+            </w:r>
+          </w:p>
+        </w:tc>
+        <w:tc>
+          <w:tcPr>
+            <w:tcW w:type="dxa" w:w="2520"/>
+          </w:tcPr>
+          <w:p>
+            <w:pPr>
+              <w:keepNext/>
+            </w:pPr>
+            <w:r>
+              <w:rPr>
+                <w:sz w:val="18"/>
+              </w:rPr>
+              <w:t>7</w:t>
+            </w:r>
+          </w:p>
+        </w:tc>
+      </w:tr>
+      <w:tr>
+        <w:tc>
+          <w:tcPr>
+            <w:tcW w:type="dxa" w:w="2520"/>
+          </w:tcPr>
+          <w:p>
+            <w:pPr>
+              <w:keepNext/>
+            </w:pPr>
+            <w:r>
+              <w:rPr>
+                <w:sz w:val="18"/>
+              </w:rPr>
+              <w:t>target value not located verbatim</w:t>
+            </w:r>
+          </w:p>
+        </w:tc>
+        <w:tc>
+          <w:tcPr>
+            <w:tcW w:type="dxa" w:w="2520"/>
+          </w:tcPr>
+          <w:p>
+            <w:pPr>
+              <w:keepNext/>
+            </w:pPr>
+            <w:r>
+              <w:rPr>
+                <w:sz w:val="18"/>
+              </w:rPr>
+              <w:t>4</w:t>
+            </w:r>
+          </w:p>
+        </w:tc>
+        <w:tc>
+          <w:tcPr>
+            <w:tcW w:type="dxa" w:w="2520"/>
+          </w:tcPr>
+          <w:p>
+            <w:pPr>
+              <w:keepNext/>
+            </w:pPr>
+            <w:r>
+              <w:rPr>
+                <w:sz w:val="18"/>
+              </w:rPr>
+              <w:t>4</w:t>
+            </w:r>
+          </w:p>
+        </w:tc>
+        <w:tc>
+          <w:tcPr>
+            <w:tcW w:type="dxa" w:w="2520"/>
+          </w:tcPr>
+          <w:p>
+            <w:pPr>
+              <w:keepNext/>
+            </w:pPr>
+            <w:r>
+              <w:rPr>
+                <w:sz w:val="18"/>
+              </w:rPr>
+              <w:t>4</w:t>
+            </w:r>
+          </w:p>
+        </w:tc>
+      </w:tr>
+      <w:tr>
+        <w:tc>
+          <w:tcPr>
+            <w:tcW w:type="dxa" w:w="2520"/>
+          </w:tcPr>
+          <w:p>
+            <w:pPr>
+              <w:keepNext w:val="0"/>
+            </w:pPr>
+            <w:r>
+              <w:rPr>
+                <w:sz w:val="18"/>
+              </w:rPr>
+              <w:t>unresolved</w:t>
+            </w:r>
+          </w:p>
+        </w:tc>
+        <w:tc>
+          <w:tcPr>
+            <w:tcW w:type="dxa" w:w="2520"/>
+          </w:tcPr>
+          <w:p>
+            <w:pPr>
+              <w:keepNext w:val="0"/>
+            </w:pPr>
+            <w:r>
+              <w:rPr>
+                <w:sz w:val="18"/>
+              </w:rPr>
+              <w:t>0</w:t>
+            </w:r>
+          </w:p>
+        </w:tc>
+        <w:tc>
+          <w:tcPr>
+            <w:tcW w:type="dxa" w:w="2520"/>
+          </w:tcPr>
+          <w:p>
+            <w:pPr>
+              <w:keepNext w:val="0"/>
+            </w:pPr>
+            <w:r>
+              <w:rPr>
+                <w:sz w:val="18"/>
+              </w:rPr>
+              <w:t>2</w:t>
+            </w:r>
+          </w:p>
+        </w:tc>
+        <w:tc>
+          <w:tcPr>
+            <w:tcW w:type="dxa" w:w="2520"/>
+          </w:tcPr>
+          <w:p>
+            <w:pPr>
+              <w:keepNext w:val="0"/>
+            </w:pPr>
+            <w:r>
+              <w:rPr>
+                <w:sz w:val="18"/>
+              </w:rPr>
+              <w:t>9</w:t>
+            </w:r>
+          </w:p>
+        </w:tc>
+      </w:tr>
+    </w:tbl>
+    <w:p>
+      <w:pPr>
+        <w:keepNext/>
+        <w:spacing w:before="280" w:after="160"/>
+      </w:pPr>
+      <w:r>
+        <w:rPr>
+          <w:i/>
+        </w:rPr>
+        <w:t>Table 8. Descriptive reveal completeness corrections proposed by the E review (papers with a code route only; descriptive, not executed).</w:t>
+      </w:r>
+    </w:p>
+    <w:tbl>
+      <w:tblPr>
+        <w:tblStyle w:val="TableGrid"/>
+        <w:tblW w:type="auto" w:w="0"/>
+        <w:tblLook w:firstColumn="1" w:firstRow="1" w:lastColumn="0" w:lastRow="0" w:noHBand="0" w:noVBand="1" w:val="04A0"/>
+      </w:tblPr>
+      <w:tblGrid>
+        <w:gridCol w:w="2520"/>
+        <w:gridCol w:w="2520"/>
+        <w:gridCol w:w="2520"/>
+        <w:gridCol w:w="2520"/>
+      </w:tblGrid>
+      <w:tr>
+        <w:tc>
+          <w:tcPr>
+            <w:tcW w:type="dxa" w:w="2520"/>
+          </w:tcPr>
+          <w:p>
+            <w:pPr>
+              <w:keepNext/>
+            </w:pPr>
+            <w:r>
+              <w:rPr>
+                <w:sz w:val="18"/>
+              </w:rPr>
+              <w:t>Paper</w:t>
+            </w:r>
+          </w:p>
+        </w:tc>
+        <w:tc>
+          <w:tcPr>
+            <w:tcW w:type="dxa" w:w="2520"/>
+          </w:tcPr>
+          <w:p>
+            <w:pPr>
+              <w:keepNext/>
+            </w:pPr>
+            <w:r>
+              <w:rPr>
+                <w:sz w:val="18"/>
+              </w:rPr>
+              <w:t>Dimension</w:t>
+            </w:r>
+          </w:p>
+        </w:tc>
+        <w:tc>
+          <w:tcPr>
+            <w:tcW w:type="dxa" w:w="2520"/>
+          </w:tcPr>
+          <w:p>
+            <w:pPr>
+              <w:keepNext/>
+            </w:pPr>
+            <w:r>
+              <w:rPr>
+                <w:sz w:val="18"/>
+              </w:rPr>
+              <w:t>Frozen</w:t>
+            </w:r>
+          </w:p>
+        </w:tc>
+        <w:tc>
+          <w:tcPr>
+            <w:tcW w:type="dxa" w:w="2520"/>
+          </w:tcPr>
+          <w:p>
+            <w:pPr>
+              <w:keepNext/>
+            </w:pPr>
+            <w:r>
+              <w:rPr>
+                <w:sz w:val="18"/>
+              </w:rPr>
+              <w:t>Adjusted</w:t>
+            </w:r>
+          </w:p>
+        </w:tc>
+      </w:tr>
+      <w:tr>
+        <w:tc>
+          <w:tcPr>
+            <w:tcW w:type="dxa" w:w="2520"/>
+          </w:tcPr>
+          <w:p>
+            <w:pPr>
+              <w:keepNext/>
+            </w:pPr>
+            <w:r>
+              <w:rPr>
+                <w:sz w:val="18"/>
+              </w:rPr>
+              <w:t>PMID:41091855</w:t>
+            </w:r>
+          </w:p>
+        </w:tc>
+        <w:tc>
+          <w:tcPr>
+            <w:tcW w:type="dxa" w:w="2520"/>
+          </w:tcPr>
+          <w:p>
+            <w:pPr>
+              <w:keepNext/>
+            </w:pPr>
+            <w:r>
+              <w:rPr>
+                <w:sz w:val="18"/>
+              </w:rPr>
+              <w:t>exclusions</w:t>
+            </w:r>
+          </w:p>
+        </w:tc>
+        <w:tc>
+          <w:tcPr>
+            <w:tcW w:type="dxa" w:w="2520"/>
+          </w:tcPr>
+          <w:p>
+            <w:pPr>
+              <w:keepNext/>
+            </w:pPr>
+            <w:r>
+              <w:rPr>
+                <w:sz w:val="18"/>
+              </w:rPr>
+              <w:t>explicit</w:t>
+            </w:r>
+          </w:p>
+        </w:tc>
+        <w:tc>
+          <w:tcPr>
+            <w:tcW w:type="dxa" w:w="2520"/>
+          </w:tcPr>
+          <w:p>
+            <w:pPr>
+              <w:keepNext/>
+            </w:pPr>
+            <w:r>
+              <w:rPr>
+                <w:sz w:val="18"/>
+              </w:rPr>
+              <w:t>partial</w:t>
+            </w:r>
+          </w:p>
+        </w:tc>
+      </w:tr>
+      <w:tr>
+        <w:tc>
+          <w:tcPr>
+            <w:tcW w:type="dxa" w:w="2520"/>
+          </w:tcPr>
+          <w:p>
+            <w:pPr>
+              <w:keepNext/>
+            </w:pPr>
+            <w:r>
+              <w:rPr>
+                <w:sz w:val="18"/>
+              </w:rPr>
+              <w:t>PMID:41091855</w:t>
+            </w:r>
+          </w:p>
+        </w:tc>
+        <w:tc>
+          <w:tcPr>
+            <w:tcW w:type="dxa" w:w="2520"/>
+          </w:tcPr>
+          <w:p>
+            <w:pPr>
+              <w:keepNext/>
+            </w:pPr>
+            <w:r>
+              <w:rPr>
+                <w:sz w:val="18"/>
+              </w:rPr>
+              <w:t>filtering</w:t>
+            </w:r>
+          </w:p>
+        </w:tc>
+        <w:tc>
+          <w:tcPr>
+            <w:tcW w:type="dxa" w:w="2520"/>
+          </w:tcPr>
+          <w:p>
+            <w:pPr>
+              <w:keepNext/>
+            </w:pPr>
+            <w:r>
+              <w:rPr>
+                <w:sz w:val="18"/>
+              </w:rPr>
+              <w:t>explicit</w:t>
+            </w:r>
+          </w:p>
+        </w:tc>
+        <w:tc>
+          <w:tcPr>
+            <w:tcW w:type="dxa" w:w="2520"/>
+          </w:tcPr>
+          <w:p>
+            <w:pPr>
+              <w:keepNext/>
+            </w:pPr>
+            <w:r>
+              <w:rPr>
+                <w:sz w:val="18"/>
+              </w:rPr>
+              <w:t>partial</w:t>
+            </w:r>
+          </w:p>
+        </w:tc>
+      </w:tr>
+      <w:tr>
+        <w:tc>
+          <w:tcPr>
+            <w:tcW w:type="dxa" w:w="2520"/>
+          </w:tcPr>
+          <w:p>
+            <w:pPr>
+              <w:keepNext/>
+            </w:pPr>
+            <w:r>
+              <w:rPr>
+                <w:sz w:val="18"/>
+              </w:rPr>
+              <w:t>PMID:41091855</w:t>
+            </w:r>
+          </w:p>
+        </w:tc>
+        <w:tc>
+          <w:tcPr>
+            <w:tcW w:type="dxa" w:w="2520"/>
+          </w:tcPr>
+          <w:p>
+            <w:pPr>
+              <w:keepNext/>
+            </w:pPr>
+            <w:r>
+              <w:rPr>
+                <w:sz w:val="18"/>
+              </w:rPr>
+              <w:t>manual transformations</w:t>
+            </w:r>
+          </w:p>
+        </w:tc>
+        <w:tc>
+          <w:tcPr>
+            <w:tcW w:type="dxa" w:w="2520"/>
+          </w:tcPr>
+          <w:p>
+            <w:pPr>
+              <w:keepNext/>
+            </w:pPr>
+            <w:r>
+              <w:rPr>
+                <w:sz w:val="18"/>
+              </w:rPr>
+              <w:t>explicit</w:t>
+            </w:r>
+          </w:p>
+        </w:tc>
+        <w:tc>
+          <w:tcPr>
+            <w:tcW w:type="dxa" w:w="2520"/>
+          </w:tcPr>
+          <w:p>
+            <w:pPr>
+              <w:keepNext/>
+            </w:pPr>
+            <w:r>
+              <w:rPr>
+                <w:sz w:val="18"/>
+              </w:rPr>
+              <w:t>not reported</w:t>
+            </w:r>
+          </w:p>
+        </w:tc>
+      </w:tr>
+      <w:tr>
+        <w:tc>
+          <w:tcPr>
+            <w:tcW w:type="dxa" w:w="2520"/>
+          </w:tcPr>
+          <w:p>
+            <w:pPr>
+              <w:keepNext/>
+            </w:pPr>
+            <w:r>
+              <w:rPr>
+                <w:sz w:val="18"/>
+              </w:rPr>
+              <w:t>PMID:41091855</w:t>
+            </w:r>
+          </w:p>
+        </w:tc>
+        <w:tc>
+          <w:tcPr>
+            <w:tcW w:type="dxa" w:w="2520"/>
+          </w:tcPr>
+          <w:p>
+            <w:pPr>
+              <w:keepNext/>
+            </w:pPr>
+            <w:r>
+              <w:rPr>
+                <w:sz w:val="18"/>
+              </w:rPr>
+              <w:t>normalization</w:t>
+            </w:r>
+          </w:p>
+        </w:tc>
+        <w:tc>
+          <w:tcPr>
+            <w:tcW w:type="dxa" w:w="2520"/>
+          </w:tcPr>
+          <w:p>
+            <w:pPr>
+              <w:keepNext/>
+            </w:pPr>
+            <w:r>
+              <w:rPr>
+                <w:sz w:val="18"/>
+              </w:rPr>
+              <w:t>explicit</w:t>
+            </w:r>
+          </w:p>
+        </w:tc>
+        <w:tc>
+          <w:tcPr>
+            <w:tcW w:type="dxa" w:w="2520"/>
+          </w:tcPr>
+          <w:p>
+            <w:pPr>
+              <w:keepNext/>
+            </w:pPr>
+            <w:r>
+              <w:rPr>
+                <w:sz w:val="18"/>
+              </w:rPr>
+              <w:t>partial</w:t>
+            </w:r>
+          </w:p>
+        </w:tc>
+      </w:tr>
+      <w:tr>
+        <w:tc>
+          <w:tcPr>
+            <w:tcW w:type="dxa" w:w="2520"/>
+          </w:tcPr>
+          <w:p>
+            <w:pPr>
+              <w:keepNext w:val="0"/>
+            </w:pPr>
+            <w:r>
+              <w:rPr>
+                <w:sz w:val="18"/>
+              </w:rPr>
+              <w:t>PMID:41677189</w:t>
+            </w:r>
+          </w:p>
+        </w:tc>
+        <w:tc>
+          <w:tcPr>
+            <w:tcW w:type="dxa" w:w="2520"/>
+          </w:tcPr>
+          <w:p>
+            <w:pPr>
+              <w:keepNext w:val="0"/>
+            </w:pPr>
+            <w:r>
+              <w:rPr>
+                <w:sz w:val="18"/>
+              </w:rPr>
+              <w:t>exclusions</w:t>
+            </w:r>
+          </w:p>
+        </w:tc>
+        <w:tc>
+          <w:tcPr>
+            <w:tcW w:type="dxa" w:w="2520"/>
+          </w:tcPr>
+          <w:p>
+            <w:pPr>
+              <w:keepNext w:val="0"/>
+            </w:pPr>
+            <w:r>
+              <w:rPr>
+                <w:sz w:val="18"/>
+              </w:rPr>
+              <w:t>explicit</w:t>
+            </w:r>
+          </w:p>
+        </w:tc>
+        <w:tc>
+          <w:tcPr>
+            <w:tcW w:type="dxa" w:w="2520"/>
+          </w:tcPr>
+          <w:p>
+            <w:pPr>
+              <w:keepNext w:val="0"/>
+            </w:pPr>
+            <w:r>
+              <w:rPr>
+                <w:sz w:val="18"/>
+              </w:rPr>
+              <w:t>partial</w:t>
+            </w:r>
+          </w:p>
+        </w:tc>
+      </w:tr>
+    </w:tbl>
+    <w:p>
+      <w:pPr>
+        <w:keepNext/>
+        <w:spacing w:before="280" w:after="160"/>
+      </w:pPr>
+      <w:r>
+        <w:rPr>
+          <w:i/>
+        </w:rPr>
+        <w:t>Table 9. Human validation (Section D): PENDING — no participant, case or outcome data exist.</w:t>
+      </w:r>
+    </w:p>
+    <w:tbl>
+      <w:tblPr>
+        <w:tblStyle w:val="TableGrid"/>
+        <w:tblW w:type="auto" w:w="0"/>
+        <w:tblLook w:firstColumn="1" w:firstRow="1" w:lastColumn="0" w:lastRow="0" w:noHBand="0" w:noVBand="1" w:val="04A0"/>
+      </w:tblPr>
+      <w:tblGrid>
+        <w:gridCol w:w="5040"/>
+        <w:gridCol w:w="5040"/>
+      </w:tblGrid>
+      <w:tr>
+        <w:tc>
+          <w:tcPr>
+            <w:tcW w:type="dxa" w:w="5040"/>
+          </w:tcPr>
+          <w:p>
+            <w:pPr>
+              <w:keepNext/>
+            </w:pPr>
+            <w:r>
+              <w:rPr>
+                <w:sz w:val="18"/>
+              </w:rPr>
+              <w:t>Item</w:t>
+            </w:r>
+          </w:p>
+        </w:tc>
+        <w:tc>
+          <w:tcPr>
+            <w:tcW w:type="dxa" w:w="5040"/>
+          </w:tcPr>
+          <w:p>
+            <w:pPr>
+              <w:keepNext/>
+            </w:pPr>
+            <w:r>
+              <w:rPr>
+                <w:sz w:val="18"/>
+              </w:rPr>
+              <w:t>Value</w:t>
+            </w:r>
+          </w:p>
+        </w:tc>
+      </w:tr>
+      <w:tr>
+        <w:tc>
+          <w:tcPr>
+            <w:tcW w:type="dxa" w:w="5040"/>
+          </w:tcPr>
+          <w:p>
+            <w:pPr>
+              <w:keepNext w:val="0"/>
+            </w:pPr>
+            <w:r>
+              <w:rPr>
+                <w:sz w:val="18"/>
+              </w:rPr>
+              <w:t>Cases completed</w:t>
+            </w:r>
+          </w:p>
+        </w:tc>
+        <w:tc>
+          <w:tcPr>
+            <w:tcW w:type="dxa" w:w="5040"/>
+          </w:tcPr>
+          <w:p>
+            <w:pPr>
+              <w:keepNext w:val="0"/>
+            </w:pPr>
+            <w:r>
+              <w:rPr>
+                <w:sz w:val="18"/>
+              </w:rPr>
+              <w:t>0 (pending external human validation)</w:t>
+            </w:r>
+          </w:p>
+        </w:tc>
+      </w:tr>
+    </w:tbl>
+    <w:p>
+      <w:pPr>
+        <w:keepNext/>
+        <w:spacing w:before="280" w:after="160"/>
+      </w:pPr>
+      <w:r>
+        <w:rPr>
+          <w:i/>
+        </w:rPr>
         <w:t>Table S1. Analytic Wilson precision planning.</w:t>
       </w:r>
     </w:p>
@@ -6172,7 +7709,7 @@
         <w:color w:val="9A3412"/>
         <w:sz w:val="16"/>
       </w:rPr>
-      <w:t>PREPARATION DRAFT — NOT SUBMISSION READY</w:t>
+      <w:t>DRAFT — NOT SUBMISSION READY: main study sealed; delegated mechanical adjudication; A/B/C/E AI-assisted review imported as a provisional sensitivity layer; investigator sign-off, human adjudication and human validation (Section D) pending</w:t>
     </w:r>
   </w:p>
 </w:ftr>

</xml_diff>

<commit_message>
Integrate input-state identifiability as an ACCESS-stage refinement
Refine ACCESS into resource accessibility / input-state identifiability /
historical-state retrievability without adding a top-level stage. Adds Methods
2.1a, Discussion 7.1, a proposed minimum reporting set, Tables 10-11
(requirement-to-stage mapping; descriptive fields as recorded), Figure 1
annotation, public retrieval ledger of the 21 served inputs, 11 verified
references with a citation verification table, README/note documentation and
nine QC checks. No gate, barrier state, sealed outcome, A/B/C/E record or
Section D status is changed.

Co-Authored-By: Tatsuki Onishi <bougtoir@gmail.com>
</commit_message>
<xml_diff>
--- a/paper2_reconstruction/manuscript/Editable_tables_EN.docx
+++ b/paper2_reconstruction/manuscript/Editable_tables_EN.docx
@@ -7164,6 +7164,1704 @@
                 <w:sz w:val="18"/>
               </w:rPr>
               <w:t>0 (pending external human validation)</w:t>
+            </w:r>
+          </w:p>
+        </w:tc>
+      </w:tr>
+    </w:tbl>
+    <w:p>
+      <w:pPr>
+        <w:keepNext/>
+        <w:spacing w:before="280" w:after="160"/>
+      </w:pPr>
+      <w:r>
+        <w:rPr>
+          <w:i/>
+        </w:rPr>
+        <w:t>Table 10. Conceptual mapping of reproducibility requirements to framework stages. ACCESS is refined into resource accessibility, input-state identifiability and historical-state retrievability; the mapping is conceptual, not an empirical result.</w:t>
+      </w:r>
+    </w:p>
+    <w:tbl>
+      <w:tblPr>
+        <w:tblStyle w:val="TableGrid"/>
+        <w:tblW w:type="auto" w:w="0"/>
+        <w:tblLook w:firstColumn="1" w:firstRow="1" w:lastColumn="0" w:lastRow="0" w:noHBand="0" w:noVBand="1" w:val="04A0"/>
+      </w:tblPr>
+      <w:tblGrid>
+        <w:gridCol w:w="3360"/>
+        <w:gridCol w:w="3360"/>
+        <w:gridCol w:w="3360"/>
+      </w:tblGrid>
+      <w:tr>
+        <w:tc>
+          <w:tcPr>
+            <w:tcW w:type="dxa" w:w="3360"/>
+          </w:tcPr>
+          <w:p>
+            <w:pPr>
+              <w:keepNext/>
+            </w:pPr>
+            <w:r>
+              <w:rPr>
+                <w:sz w:val="18"/>
+              </w:rPr>
+              <w:t>Requirement</w:t>
+            </w:r>
+          </w:p>
+        </w:tc>
+        <w:tc>
+          <w:tcPr>
+            <w:tcW w:type="dxa" w:w="3360"/>
+          </w:tcPr>
+          <w:p>
+            <w:pPr>
+              <w:keepNext/>
+            </w:pPr>
+            <w:r>
+              <w:rPr>
+                <w:sz w:val="18"/>
+              </w:rPr>
+              <w:t>Stage</w:t>
+            </w:r>
+          </w:p>
+        </w:tc>
+        <w:tc>
+          <w:tcPr>
+            <w:tcW w:type="dxa" w:w="3360"/>
+          </w:tcPr>
+          <w:p>
+            <w:pPr>
+              <w:keepNext/>
+            </w:pPr>
+            <w:r>
+              <w:rPr>
+                <w:sz w:val="18"/>
+              </w:rPr>
+              <w:t>Purpose</w:t>
+            </w:r>
+          </w:p>
+        </w:tc>
+      </w:tr>
+      <w:tr>
+        <w:tc>
+          <w:tcPr>
+            <w:tcW w:type="dxa" w:w="3360"/>
+          </w:tcPr>
+          <w:p>
+            <w:pPr>
+              <w:keepNext/>
+            </w:pPr>
+            <w:r>
+              <w:rPr>
+                <w:sz w:val="18"/>
+              </w:rPr>
+              <w:t>repository/accession</w:t>
+            </w:r>
+          </w:p>
+        </w:tc>
+        <w:tc>
+          <w:tcPr>
+            <w:tcW w:type="dxa" w:w="3360"/>
+          </w:tcPr>
+          <w:p>
+            <w:pPr>
+              <w:keepNext/>
+            </w:pPr>
+            <w:r>
+              <w:rPr>
+                <w:sz w:val="18"/>
+              </w:rPr>
+              <w:t>ACCESS</w:t>
+            </w:r>
+          </w:p>
+        </w:tc>
+        <w:tc>
+          <w:tcPr>
+            <w:tcW w:type="dxa" w:w="3360"/>
+          </w:tcPr>
+          <w:p>
+            <w:pPr>
+              <w:keepNext/>
+            </w:pPr>
+            <w:r>
+              <w:rPr>
+                <w:sz w:val="18"/>
+              </w:rPr>
+              <w:t>identify data source</w:t>
+            </w:r>
+          </w:p>
+        </w:tc>
+      </w:tr>
+      <w:tr>
+        <w:tc>
+          <w:tcPr>
+            <w:tcW w:type="dxa" w:w="3360"/>
+          </w:tcPr>
+          <w:p>
+            <w:pPr>
+              <w:keepNext/>
+            </w:pPr>
+            <w:r>
+              <w:rPr>
+                <w:sz w:val="18"/>
+              </w:rPr>
+              <w:t>release/version</w:t>
+            </w:r>
+          </w:p>
+        </w:tc>
+        <w:tc>
+          <w:tcPr>
+            <w:tcW w:type="dxa" w:w="3360"/>
+          </w:tcPr>
+          <w:p>
+            <w:pPr>
+              <w:keepNext/>
+            </w:pPr>
+            <w:r>
+              <w:rPr>
+                <w:sz w:val="18"/>
+              </w:rPr>
+              <w:t>ACCESS</w:t>
+            </w:r>
+          </w:p>
+        </w:tc>
+        <w:tc>
+          <w:tcPr>
+            <w:tcW w:type="dxa" w:w="3360"/>
+          </w:tcPr>
+          <w:p>
+            <w:pPr>
+              <w:keepNext/>
+            </w:pPr>
+            <w:r>
+              <w:rPr>
+                <w:sz w:val="18"/>
+              </w:rPr>
+              <w:t>identify exact dataset state</w:t>
+            </w:r>
+          </w:p>
+        </w:tc>
+      </w:tr>
+      <w:tr>
+        <w:tc>
+          <w:tcPr>
+            <w:tcW w:type="dxa" w:w="3360"/>
+          </w:tcPr>
+          <w:p>
+            <w:pPr>
+              <w:keepNext/>
+            </w:pPr>
+            <w:r>
+              <w:rPr>
+                <w:sz w:val="18"/>
+              </w:rPr>
+              <w:t>retrieval date/time</w:t>
+            </w:r>
+          </w:p>
+        </w:tc>
+        <w:tc>
+          <w:tcPr>
+            <w:tcW w:type="dxa" w:w="3360"/>
+          </w:tcPr>
+          <w:p>
+            <w:pPr>
+              <w:keepNext/>
+            </w:pPr>
+            <w:r>
+              <w:rPr>
+                <w:sz w:val="18"/>
+              </w:rPr>
+              <w:t>ACCESS</w:t>
+            </w:r>
+          </w:p>
+        </w:tc>
+        <w:tc>
+          <w:tcPr>
+            <w:tcW w:type="dxa" w:w="3360"/>
+          </w:tcPr>
+          <w:p>
+            <w:pPr>
+              <w:keepNext/>
+            </w:pPr>
+            <w:r>
+              <w:rPr>
+                <w:sz w:val="18"/>
+              </w:rPr>
+              <w:t>anchor dynamic resource state in time</w:t>
+            </w:r>
+          </w:p>
+        </w:tc>
+      </w:tr>
+      <w:tr>
+        <w:tc>
+          <w:tcPr>
+            <w:tcW w:type="dxa" w:w="3360"/>
+          </w:tcPr>
+          <w:p>
+            <w:pPr>
+              <w:keepNext/>
+            </w:pPr>
+            <w:r>
+              <w:rPr>
+                <w:sz w:val="18"/>
+              </w:rPr>
+              <w:t>exact query/API parameters</w:t>
+            </w:r>
+          </w:p>
+        </w:tc>
+        <w:tc>
+          <w:tcPr>
+            <w:tcW w:type="dxa" w:w="3360"/>
+          </w:tcPr>
+          <w:p>
+            <w:pPr>
+              <w:keepNext/>
+            </w:pPr>
+            <w:r>
+              <w:rPr>
+                <w:sz w:val="18"/>
+              </w:rPr>
+              <w:t>ACCESS</w:t>
+            </w:r>
+          </w:p>
+        </w:tc>
+        <w:tc>
+          <w:tcPr>
+            <w:tcW w:type="dxa" w:w="3360"/>
+          </w:tcPr>
+          <w:p>
+            <w:pPr>
+              <w:keepNext/>
+            </w:pPr>
+            <w:r>
+              <w:rPr>
+                <w:sz w:val="18"/>
+              </w:rPr>
+              <w:t>reconstruct query-generated input</w:t>
+            </w:r>
+          </w:p>
+        </w:tc>
+      </w:tr>
+      <w:tr>
+        <w:tc>
+          <w:tcPr>
+            <w:tcW w:type="dxa" w:w="3360"/>
+          </w:tcPr>
+          <w:p>
+            <w:pPr>
+              <w:keepNext/>
+            </w:pPr>
+            <w:r>
+              <w:rPr>
+                <w:sz w:val="18"/>
+              </w:rPr>
+              <w:t>file list/schema</w:t>
+            </w:r>
+          </w:p>
+        </w:tc>
+        <w:tc>
+          <w:tcPr>
+            <w:tcW w:type="dxa" w:w="3360"/>
+          </w:tcPr>
+          <w:p>
+            <w:pPr>
+              <w:keepNext/>
+            </w:pPr>
+            <w:r>
+              <w:rPr>
+                <w:sz w:val="18"/>
+              </w:rPr>
+              <w:t>ACCESS</w:t>
+            </w:r>
+          </w:p>
+        </w:tc>
+        <w:tc>
+          <w:tcPr>
+            <w:tcW w:type="dxa" w:w="3360"/>
+          </w:tcPr>
+          <w:p>
+            <w:pPr>
+              <w:keepNext/>
+            </w:pPr>
+            <w:r>
+              <w:rPr>
+                <w:sz w:val="18"/>
+              </w:rPr>
+              <w:t>fix input composition/structure</w:t>
+            </w:r>
+          </w:p>
+        </w:tc>
+      </w:tr>
+      <w:tr>
+        <w:tc>
+          <w:tcPr>
+            <w:tcW w:type="dxa" w:w="3360"/>
+          </w:tcPr>
+          <w:p>
+            <w:pPr>
+              <w:keepNext/>
+            </w:pPr>
+            <w:r>
+              <w:rPr>
+                <w:sz w:val="18"/>
+              </w:rPr>
+              <w:t>SHA-256/content hash</w:t>
+            </w:r>
+          </w:p>
+        </w:tc>
+        <w:tc>
+          <w:tcPr>
+            <w:tcW w:type="dxa" w:w="3360"/>
+          </w:tcPr>
+          <w:p>
+            <w:pPr>
+              <w:keepNext/>
+            </w:pPr>
+            <w:r>
+              <w:rPr>
+                <w:sz w:val="18"/>
+              </w:rPr>
+              <w:t>ACCESS / REPRODUCE</w:t>
+            </w:r>
+          </w:p>
+        </w:tc>
+        <w:tc>
+          <w:tcPr>
+            <w:tcW w:type="dxa" w:w="3360"/>
+          </w:tcPr>
+          <w:p>
+            <w:pPr>
+              <w:keepNext/>
+            </w:pPr>
+            <w:r>
+              <w:rPr>
+                <w:sz w:val="18"/>
+              </w:rPr>
+              <w:t>verify byte-level identity</w:t>
+            </w:r>
+          </w:p>
+        </w:tc>
+      </w:tr>
+      <w:tr>
+        <w:tc>
+          <w:tcPr>
+            <w:tcW w:type="dxa" w:w="3360"/>
+          </w:tcPr>
+          <w:p>
+            <w:pPr>
+              <w:keepNext/>
+            </w:pPr>
+            <w:r>
+              <w:rPr>
+                <w:sz w:val="18"/>
+              </w:rPr>
+              <w:t>transformation log</w:t>
+            </w:r>
+          </w:p>
+        </w:tc>
+        <w:tc>
+          <w:tcPr>
+            <w:tcW w:type="dxa" w:w="3360"/>
+          </w:tcPr>
+          <w:p>
+            <w:pPr>
+              <w:keepNext/>
+            </w:pPr>
+            <w:r>
+              <w:rPr>
+                <w:sz w:val="18"/>
+              </w:rPr>
+              <w:t>RECONSTRUCT / REPRODUCE</w:t>
+            </w:r>
+          </w:p>
+        </w:tc>
+        <w:tc>
+          <w:tcPr>
+            <w:tcW w:type="dxa" w:w="3360"/>
+          </w:tcPr>
+          <w:p>
+            <w:pPr>
+              <w:keepNext/>
+            </w:pPr>
+            <w:r>
+              <w:rPr>
+                <w:sz w:val="18"/>
+              </w:rPr>
+              <w:t>trace derivation from raw to analytical input</w:t>
+            </w:r>
+          </w:p>
+        </w:tc>
+      </w:tr>
+      <w:tr>
+        <w:tc>
+          <w:tcPr>
+            <w:tcW w:type="dxa" w:w="3360"/>
+          </w:tcPr>
+          <w:p>
+            <w:pPr>
+              <w:keepNext/>
+            </w:pPr>
+            <w:r>
+              <w:rPr>
+                <w:sz w:val="18"/>
+              </w:rPr>
+              <w:t>license/redistribution status</w:t>
+            </w:r>
+          </w:p>
+        </w:tc>
+        <w:tc>
+          <w:tcPr>
+            <w:tcW w:type="dxa" w:w="3360"/>
+          </w:tcPr>
+          <w:p>
+            <w:pPr>
+              <w:keepNext/>
+            </w:pPr>
+            <w:r>
+              <w:rPr>
+                <w:sz w:val="18"/>
+              </w:rPr>
+              <w:t>ACCESS</w:t>
+            </w:r>
+          </w:p>
+        </w:tc>
+        <w:tc>
+          <w:tcPr>
+            <w:tcW w:type="dxa" w:w="3360"/>
+          </w:tcPr>
+          <w:p>
+            <w:pPr>
+              <w:keepNext/>
+            </w:pPr>
+            <w:r>
+              <w:rPr>
+                <w:sz w:val="18"/>
+              </w:rPr>
+              <w:t>explain why exact snapshot can or cannot be redistributed</w:t>
+            </w:r>
+          </w:p>
+        </w:tc>
+      </w:tr>
+      <w:tr>
+        <w:tc>
+          <w:tcPr>
+            <w:tcW w:type="dxa" w:w="3360"/>
+          </w:tcPr>
+          <w:p>
+            <w:pPr>
+              <w:keepNext/>
+            </w:pPr>
+            <w:r>
+              <w:rPr>
+                <w:sz w:val="18"/>
+              </w:rPr>
+              <w:t>code availability</w:t>
+            </w:r>
+          </w:p>
+        </w:tc>
+        <w:tc>
+          <w:tcPr>
+            <w:tcW w:type="dxa" w:w="3360"/>
+          </w:tcPr>
+          <w:p>
+            <w:pPr>
+              <w:keepNext/>
+            </w:pPr>
+            <w:r>
+              <w:rPr>
+                <w:sz w:val="18"/>
+              </w:rPr>
+              <w:t>ACCESS</w:t>
+            </w:r>
+          </w:p>
+        </w:tc>
+        <w:tc>
+          <w:tcPr>
+            <w:tcW w:type="dxa" w:w="3360"/>
+          </w:tcPr>
+          <w:p>
+            <w:pPr>
+              <w:keepNext/>
+            </w:pPr>
+            <w:r>
+              <w:rPr>
+                <w:sz w:val="18"/>
+              </w:rPr>
+              <w:t>locate the original implementation (not used in Paper II)</w:t>
+            </w:r>
+          </w:p>
+        </w:tc>
+      </w:tr>
+      <w:tr>
+        <w:tc>
+          <w:tcPr>
+            <w:tcW w:type="dxa" w:w="3360"/>
+          </w:tcPr>
+          <w:p>
+            <w:pPr>
+              <w:keepNext/>
+            </w:pPr>
+            <w:r>
+              <w:rPr>
+                <w:sz w:val="18"/>
+              </w:rPr>
+              <w:t>software/version reporting</w:t>
+            </w:r>
+          </w:p>
+        </w:tc>
+        <w:tc>
+          <w:tcPr>
+            <w:tcW w:type="dxa" w:w="3360"/>
+          </w:tcPr>
+          <w:p>
+            <w:pPr>
+              <w:keepNext/>
+            </w:pPr>
+            <w:r>
+              <w:rPr>
+                <w:sz w:val="18"/>
+              </w:rPr>
+              <w:t>ACCESS / EXECUTE</w:t>
+            </w:r>
+          </w:p>
+        </w:tc>
+        <w:tc>
+          <w:tcPr>
+            <w:tcW w:type="dxa" w:w="3360"/>
+          </w:tcPr>
+          <w:p>
+            <w:pPr>
+              <w:keepNext/>
+            </w:pPr>
+            <w:r>
+              <w:rPr>
+                <w:sz w:val="18"/>
+              </w:rPr>
+              <w:t>identify the executable environment</w:t>
+            </w:r>
+          </w:p>
+        </w:tc>
+      </w:tr>
+      <w:tr>
+        <w:tc>
+          <w:tcPr>
+            <w:tcW w:type="dxa" w:w="3360"/>
+          </w:tcPr>
+          <w:p>
+            <w:pPr>
+              <w:keepNext/>
+            </w:pPr>
+            <w:r>
+              <w:rPr>
+                <w:sz w:val="18"/>
+              </w:rPr>
+              <w:t>container/environment</w:t>
+            </w:r>
+          </w:p>
+        </w:tc>
+        <w:tc>
+          <w:tcPr>
+            <w:tcW w:type="dxa" w:w="3360"/>
+          </w:tcPr>
+          <w:p>
+            <w:pPr>
+              <w:keepNext/>
+            </w:pPr>
+            <w:r>
+              <w:rPr>
+                <w:sz w:val="18"/>
+              </w:rPr>
+              <w:t>EXECUTE</w:t>
+            </w:r>
+          </w:p>
+        </w:tc>
+        <w:tc>
+          <w:tcPr>
+            <w:tcW w:type="dxa" w:w="3360"/>
+          </w:tcPr>
+          <w:p>
+            <w:pPr>
+              <w:keepNext/>
+            </w:pPr>
+            <w:r>
+              <w:rPr>
+                <w:sz w:val="18"/>
+              </w:rPr>
+              <w:t>reinstate the execution environment</w:t>
+            </w:r>
+          </w:p>
+        </w:tc>
+      </w:tr>
+      <w:tr>
+        <w:tc>
+          <w:tcPr>
+            <w:tcW w:type="dxa" w:w="3360"/>
+          </w:tcPr>
+          <w:p>
+            <w:pPr>
+              <w:keepNext/>
+            </w:pPr>
+            <w:r>
+              <w:rPr>
+                <w:sz w:val="18"/>
+              </w:rPr>
+              <w:t>detailed Methods</w:t>
+            </w:r>
+          </w:p>
+        </w:tc>
+        <w:tc>
+          <w:tcPr>
+            <w:tcW w:type="dxa" w:w="3360"/>
+          </w:tcPr>
+          <w:p>
+            <w:pPr>
+              <w:keepNext/>
+            </w:pPr>
+            <w:r>
+              <w:rPr>
+                <w:sz w:val="18"/>
+              </w:rPr>
+              <w:t>RECONSTRUCT</w:t>
+            </w:r>
+          </w:p>
+        </w:tc>
+        <w:tc>
+          <w:tcPr>
+            <w:tcW w:type="dxa" w:w="3360"/>
+          </w:tcPr>
+          <w:p>
+            <w:pPr>
+              <w:keepNext/>
+            </w:pPr>
+            <w:r>
+              <w:rPr>
+                <w:sz w:val="18"/>
+              </w:rPr>
+              <w:t>specify the procedure well enough to implement</w:t>
+            </w:r>
+          </w:p>
+        </w:tc>
+      </w:tr>
+      <w:tr>
+        <w:tc>
+          <w:tcPr>
+            <w:tcW w:type="dxa" w:w="3360"/>
+          </w:tcPr>
+          <w:p>
+            <w:pPr>
+              <w:keepNext/>
+            </w:pPr>
+            <w:r>
+              <w:rPr>
+                <w:sz w:val="18"/>
+              </w:rPr>
+              <w:t>parameters/defaults</w:t>
+            </w:r>
+          </w:p>
+        </w:tc>
+        <w:tc>
+          <w:tcPr>
+            <w:tcW w:type="dxa" w:w="3360"/>
+          </w:tcPr>
+          <w:p>
+            <w:pPr>
+              <w:keepNext/>
+            </w:pPr>
+            <w:r>
+              <w:rPr>
+                <w:sz w:val="18"/>
+              </w:rPr>
+              <w:t>RECONSTRUCT</w:t>
+            </w:r>
+          </w:p>
+        </w:tc>
+        <w:tc>
+          <w:tcPr>
+            <w:tcW w:type="dxa" w:w="3360"/>
+          </w:tcPr>
+          <w:p>
+            <w:pPr>
+              <w:keepNext/>
+            </w:pPr>
+            <w:r>
+              <w:rPr>
+                <w:sz w:val="18"/>
+              </w:rPr>
+              <w:t>fix analytical choices that change results</w:t>
+            </w:r>
+          </w:p>
+        </w:tc>
+      </w:tr>
+      <w:tr>
+        <w:tc>
+          <w:tcPr>
+            <w:tcW w:type="dxa" w:w="3360"/>
+          </w:tcPr>
+          <w:p>
+            <w:pPr>
+              <w:keepNext/>
+            </w:pPr>
+            <w:r>
+              <w:rPr>
+                <w:sz w:val="18"/>
+              </w:rPr>
+              <w:t>random seed</w:t>
+            </w:r>
+          </w:p>
+        </w:tc>
+        <w:tc>
+          <w:tcPr>
+            <w:tcW w:type="dxa" w:w="3360"/>
+          </w:tcPr>
+          <w:p>
+            <w:pPr>
+              <w:keepNext/>
+            </w:pPr>
+            <w:r>
+              <w:rPr>
+                <w:sz w:val="18"/>
+              </w:rPr>
+              <w:t>EXECUTE / REPRODUCE</w:t>
+            </w:r>
+          </w:p>
+        </w:tc>
+        <w:tc>
+          <w:tcPr>
+            <w:tcW w:type="dxa" w:w="3360"/>
+          </w:tcPr>
+          <w:p>
+            <w:pPr>
+              <w:keepNext/>
+            </w:pPr>
+            <w:r>
+              <w:rPr>
+                <w:sz w:val="18"/>
+              </w:rPr>
+              <w:t>control stochastic variation</w:t>
+            </w:r>
+          </w:p>
+        </w:tc>
+      </w:tr>
+      <w:tr>
+        <w:tc>
+          <w:tcPr>
+            <w:tcW w:type="dxa" w:w="3360"/>
+          </w:tcPr>
+          <w:p>
+            <w:pPr>
+              <w:keepNext/>
+            </w:pPr>
+            <w:r>
+              <w:rPr>
+                <w:sz w:val="18"/>
+              </w:rPr>
+              <w:t>resource requirements</w:t>
+            </w:r>
+          </w:p>
+        </w:tc>
+        <w:tc>
+          <w:tcPr>
+            <w:tcW w:type="dxa" w:w="3360"/>
+          </w:tcPr>
+          <w:p>
+            <w:pPr>
+              <w:keepNext/>
+            </w:pPr>
+            <w:r>
+              <w:rPr>
+                <w:sz w:val="18"/>
+              </w:rPr>
+              <w:t>EXECUTE</w:t>
+            </w:r>
+          </w:p>
+        </w:tc>
+        <w:tc>
+          <w:tcPr>
+            <w:tcW w:type="dxa" w:w="3360"/>
+          </w:tcPr>
+          <w:p>
+            <w:pPr>
+              <w:keepNext/>
+            </w:pPr>
+            <w:r>
+              <w:rPr>
+                <w:sz w:val="18"/>
+              </w:rPr>
+              <w:t>state compute, memory and time needed</w:t>
+            </w:r>
+          </w:p>
+        </w:tc>
+      </w:tr>
+      <w:tr>
+        <w:tc>
+          <w:tcPr>
+            <w:tcW w:type="dxa" w:w="3360"/>
+          </w:tcPr>
+          <w:p>
+            <w:pPr>
+              <w:keepNext/>
+            </w:pPr>
+            <w:r>
+              <w:rPr>
+                <w:sz w:val="18"/>
+              </w:rPr>
+              <w:t>independent reconstruction</w:t>
+            </w:r>
+          </w:p>
+        </w:tc>
+        <w:tc>
+          <w:tcPr>
+            <w:tcW w:type="dxa" w:w="3360"/>
+          </w:tcPr>
+          <w:p>
+            <w:pPr>
+              <w:keepNext/>
+            </w:pPr>
+            <w:r>
+              <w:rPr>
+                <w:sz w:val="18"/>
+              </w:rPr>
+              <w:t>RECONSTRUCT → REPRODUCE</w:t>
+            </w:r>
+          </w:p>
+        </w:tc>
+        <w:tc>
+          <w:tcPr>
+            <w:tcW w:type="dxa" w:w="3360"/>
+          </w:tcPr>
+          <w:p>
+            <w:pPr>
+              <w:keepNext/>
+            </w:pPr>
+            <w:r>
+              <w:rPr>
+                <w:sz w:val="18"/>
+              </w:rPr>
+              <w:t>test the description itself</w:t>
+            </w:r>
+          </w:p>
+        </w:tc>
+      </w:tr>
+      <w:tr>
+        <w:tc>
+          <w:tcPr>
+            <w:tcW w:type="dxa" w:w="3360"/>
+          </w:tcPr>
+          <w:p>
+            <w:pPr>
+              <w:keepNext w:val="0"/>
+            </w:pPr>
+            <w:r>
+              <w:rPr>
+                <w:sz w:val="18"/>
+              </w:rPr>
+              <w:t>robustness testing</w:t>
+            </w:r>
+          </w:p>
+        </w:tc>
+        <w:tc>
+          <w:tcPr>
+            <w:tcW w:type="dxa" w:w="3360"/>
+          </w:tcPr>
+          <w:p>
+            <w:pPr>
+              <w:keepNext w:val="0"/>
+            </w:pPr>
+            <w:r>
+              <w:rPr>
+                <w:sz w:val="18"/>
+              </w:rPr>
+              <w:t>ROBUST</w:t>
+            </w:r>
+          </w:p>
+        </w:tc>
+        <w:tc>
+          <w:tcPr>
+            <w:tcW w:type="dxa" w:w="3360"/>
+          </w:tcPr>
+          <w:p>
+            <w:pPr>
+              <w:keepNext w:val="0"/>
+            </w:pPr>
+            <w:r>
+              <w:rPr>
+                <w:sz w:val="18"/>
+              </w:rPr>
+              <w:t>vary reasonable choices (Paper III; excluded here)</w:t>
+            </w:r>
+          </w:p>
+        </w:tc>
+      </w:tr>
+    </w:tbl>
+    <w:p>
+      <w:pPr>
+        <w:keepNext/>
+        <w:spacing w:before="280" w:after="160"/>
+      </w:pPr>
+      <w:r>
+        <w:rPr>
+          <w:i/>
+        </w:rPr>
+        <w:t>Table 11. ACCESS-stage input-state fields as recorded in the frozen main-study records (descriptive; fields not recorded are reported as such; no dataset drift was measured).</w:t>
+      </w:r>
+    </w:p>
+    <w:tbl>
+      <w:tblPr>
+        <w:tblStyle w:val="TableGrid"/>
+        <w:tblW w:type="auto" w:w="0"/>
+        <w:tblLook w:firstColumn="1" w:firstRow="1" w:lastColumn="0" w:lastRow="0" w:noHBand="0" w:noVBand="1" w:val="04A0"/>
+      </w:tblPr>
+      <w:tblGrid>
+        <w:gridCol w:w="3360"/>
+        <w:gridCol w:w="3360"/>
+        <w:gridCol w:w="3360"/>
+      </w:tblGrid>
+      <w:tr>
+        <w:tc>
+          <w:tcPr>
+            <w:tcW w:type="dxa" w:w="3360"/>
+          </w:tcPr>
+          <w:p>
+            <w:pPr>
+              <w:keepNext/>
+            </w:pPr>
+            <w:r>
+              <w:rPr>
+                <w:sz w:val="18"/>
+              </w:rPr>
+              <w:t>Item</w:t>
+            </w:r>
+          </w:p>
+        </w:tc>
+        <w:tc>
+          <w:tcPr>
+            <w:tcW w:type="dxa" w:w="3360"/>
+          </w:tcPr>
+          <w:p>
+            <w:pPr>
+              <w:keepNext/>
+            </w:pPr>
+            <w:r>
+              <w:rPr>
+                <w:sz w:val="18"/>
+              </w:rPr>
+              <w:t>Value as recorded</w:t>
+            </w:r>
+          </w:p>
+        </w:tc>
+        <w:tc>
+          <w:tcPr>
+            <w:tcW w:type="dxa" w:w="3360"/>
+          </w:tcPr>
+          <w:p>
+            <w:pPr>
+              <w:keepNext/>
+            </w:pPr>
+            <w:r>
+              <w:rPr>
+                <w:sz w:val="18"/>
+              </w:rPr>
+              <w:t>Source</w:t>
+            </w:r>
+          </w:p>
+        </w:tc>
+      </w:tr>
+      <w:tr>
+        <w:tc>
+          <w:tcPr>
+            <w:tcW w:type="dxa" w:w="3360"/>
+          </w:tcPr>
+          <w:p>
+            <w:pPr>
+              <w:keepNext/>
+            </w:pPr>
+            <w:r>
+              <w:rPr>
+                <w:sz w:val="18"/>
+              </w:rPr>
+              <w:t>repository/accession recorded</w:t>
+            </w:r>
+          </w:p>
+        </w:tc>
+        <w:tc>
+          <w:tcPr>
+            <w:tcW w:type="dxa" w:w="3360"/>
+          </w:tcPr>
+          <w:p>
+            <w:pPr>
+              <w:keepNext/>
+            </w:pPr>
+            <w:r>
+              <w:rPr>
+                <w:sz w:val="18"/>
+              </w:rPr>
+              <w:t>100/100 papers</w:t>
+            </w:r>
+          </w:p>
+        </w:tc>
+        <w:tc>
+          <w:tcPr>
+            <w:tcW w:type="dxa" w:w="3360"/>
+          </w:tcPr>
+          <w:p>
+            <w:pPr>
+              <w:keepNext/>
+            </w:pPr>
+            <w:r>
+              <w:rPr>
+                <w:sz w:val="18"/>
+              </w:rPr>
+              <w:t>delegated specification listing (100 papers)</w:t>
+            </w:r>
+          </w:p>
+        </w:tc>
+      </w:tr>
+      <w:tr>
+        <w:tc>
+          <w:tcPr>
+            <w:tcW w:type="dxa" w:w="3360"/>
+          </w:tcPr>
+          <w:p>
+            <w:pPr>
+              <w:keepNext/>
+            </w:pPr>
+            <w:r>
+              <w:rPr>
+                <w:sz w:val="18"/>
+              </w:rPr>
+              <w:t>repository kinds in listings</w:t>
+            </w:r>
+          </w:p>
+        </w:tc>
+        <w:tc>
+          <w:tcPr>
+            <w:tcW w:type="dxa" w:w="3360"/>
+          </w:tcPr>
+          <w:p>
+            <w:pPr>
+              <w:keepNext/>
+            </w:pPr>
+            <w:r>
+              <w:rPr>
+                <w:sz w:val="18"/>
+              </w:rPr>
+              <w:t>bioproject 10; dataverse 4; dryad 13; figshare 25; geo 70; osf 2; sra study 5; zenodo 19</w:t>
+            </w:r>
+          </w:p>
+        </w:tc>
+        <w:tc>
+          <w:tcPr>
+            <w:tcW w:type="dxa" w:w="3360"/>
+          </w:tcPr>
+          <w:p>
+            <w:pPr>
+              <w:keepNext/>
+            </w:pPr>
+            <w:r>
+              <w:rPr>
+                <w:sz w:val="18"/>
+              </w:rPr>
+              <w:t>delegated specification listing (100 papers)</w:t>
+            </w:r>
+          </w:p>
+        </w:tc>
+      </w:tr>
+      <w:tr>
+        <w:tc>
+          <w:tcPr>
+            <w:tcW w:type="dxa" w:w="3360"/>
+          </w:tcPr>
+          <w:p>
+            <w:pPr>
+              <w:keepNext/>
+            </w:pPr>
+            <w:r>
+              <w:rPr>
+                <w:sz w:val="18"/>
+              </w:rPr>
+              <w:t>file list recorded in listing</w:t>
+            </w:r>
+          </w:p>
+        </w:tc>
+        <w:tc>
+          <w:tcPr>
+            <w:tcW w:type="dxa" w:w="3360"/>
+          </w:tcPr>
+          <w:p>
+            <w:pPr>
+              <w:keepNext/>
+            </w:pPr>
+            <w:r>
+              <w:rPr>
+                <w:sz w:val="18"/>
+              </w:rPr>
+              <w:t>89/100 papers</w:t>
+            </w:r>
+          </w:p>
+        </w:tc>
+        <w:tc>
+          <w:tcPr>
+            <w:tcW w:type="dxa" w:w="3360"/>
+          </w:tcPr>
+          <w:p>
+            <w:pPr>
+              <w:keepNext/>
+            </w:pPr>
+            <w:r>
+              <w:rPr>
+                <w:sz w:val="18"/>
+              </w:rPr>
+              <w:t>delegated specification listing (100 papers)</w:t>
+            </w:r>
+          </w:p>
+        </w:tc>
+      </w:tr>
+      <w:tr>
+        <w:tc>
+          <w:tcPr>
+            <w:tcW w:type="dxa" w:w="3360"/>
+          </w:tcPr>
+          <w:p>
+            <w:pPr>
+              <w:keepNext/>
+            </w:pPr>
+            <w:r>
+              <w:rPr>
+                <w:sz w:val="18"/>
+              </w:rPr>
+              <w:t>external public reference resources named by specifier</w:t>
+            </w:r>
+          </w:p>
+        </w:tc>
+        <w:tc>
+          <w:tcPr>
+            <w:tcW w:type="dxa" w:w="3360"/>
+          </w:tcPr>
+          <w:p>
+            <w:pPr>
+              <w:keepNext/>
+            </w:pPr>
+            <w:r>
+              <w:rPr>
+                <w:sz w:val="18"/>
+              </w:rPr>
+              <w:t>119 entries in 51 papers</w:t>
+            </w:r>
+          </w:p>
+        </w:tc>
+        <w:tc>
+          <w:tcPr>
+            <w:tcW w:type="dxa" w:w="3360"/>
+          </w:tcPr>
+          <w:p>
+            <w:pPr>
+              <w:keepNext/>
+            </w:pPr>
+            <w:r>
+              <w:rPr>
+                <w:sz w:val="18"/>
+              </w:rPr>
+              <w:t>delegated specification listing (100 papers)</w:t>
+            </w:r>
+          </w:p>
+        </w:tc>
+      </w:tr>
+      <w:tr>
+        <w:tc>
+          <w:tcPr>
+            <w:tcW w:type="dxa" w:w="3360"/>
+          </w:tcPr>
+          <w:p>
+            <w:pPr>
+              <w:keepNext/>
+            </w:pPr>
+            <w:r>
+              <w:rPr>
+                <w:sz w:val="18"/>
+              </w:rPr>
+              <w:t>reference version/release stated in publication text</w:t>
+            </w:r>
+          </w:p>
+        </w:tc>
+        <w:tc>
+          <w:tcPr>
+            <w:tcW w:type="dxa" w:w="3360"/>
+          </w:tcPr>
+          <w:p>
+            <w:pPr>
+              <w:keepNext/>
+            </w:pPr>
+            <w:r>
+              <w:rPr>
+                <w:sz w:val="18"/>
+              </w:rPr>
+              <w:t>100/119 entries</w:t>
+            </w:r>
+          </w:p>
+        </w:tc>
+        <w:tc>
+          <w:tcPr>
+            <w:tcW w:type="dxa" w:w="3360"/>
+          </w:tcPr>
+          <w:p>
+            <w:pPr>
+              <w:keepNext/>
+            </w:pPr>
+            <w:r>
+              <w:rPr>
+                <w:sz w:val="18"/>
+              </w:rPr>
+              <w:t>delegated specification listing (100 papers)</w:t>
+            </w:r>
+          </w:p>
+        </w:tc>
+      </w:tr>
+      <w:tr>
+        <w:tc>
+          <w:tcPr>
+            <w:tcW w:type="dxa" w:w="3360"/>
+          </w:tcPr>
+          <w:p>
+            <w:pPr>
+              <w:keepNext/>
+            </w:pPr>
+            <w:r>
+              <w:rPr>
+                <w:sz w:val="18"/>
+              </w:rPr>
+              <w:t>reference version/release not specified</w:t>
+            </w:r>
+          </w:p>
+        </w:tc>
+        <w:tc>
+          <w:tcPr>
+            <w:tcW w:type="dxa" w:w="3360"/>
+          </w:tcPr>
+          <w:p>
+            <w:pPr>
+              <w:keepNext/>
+            </w:pPr>
+            <w:r>
+              <w:rPr>
+                <w:sz w:val="18"/>
+              </w:rPr>
+              <w:t>19/119 entries (11 papers with at least one)</w:t>
+            </w:r>
+          </w:p>
+        </w:tc>
+        <w:tc>
+          <w:tcPr>
+            <w:tcW w:type="dxa" w:w="3360"/>
+          </w:tcPr>
+          <w:p>
+            <w:pPr>
+              <w:keepNext/>
+            </w:pPr>
+            <w:r>
+              <w:rPr>
+                <w:sz w:val="18"/>
+              </w:rPr>
+              <w:t>delegated specification listing (100 papers)</w:t>
+            </w:r>
+          </w:p>
+        </w:tc>
+      </w:tr>
+      <w:tr>
+        <w:tc>
+          <w:tcPr>
+            <w:tcW w:type="dxa" w:w="3360"/>
+          </w:tcPr>
+          <w:p>
+            <w:pPr>
+              <w:keepNext/>
+            </w:pPr>
+            <w:r>
+              <w:rPr>
+                <w:sz w:val="18"/>
+              </w:rPr>
+              <w:t>not run because an external public reference resource was required</w:t>
+            </w:r>
+          </w:p>
+        </w:tc>
+        <w:tc>
+          <w:tcPr>
+            <w:tcW w:type="dxa" w:w="3360"/>
+          </w:tcPr>
+          <w:p>
+            <w:pPr>
+              <w:keepNext/>
+            </w:pPr>
+            <w:r>
+              <w:rPr>
+                <w:sz w:val="18"/>
+              </w:rPr>
+              <w:t>28/100 papers (frozen barrier state, unchanged)</w:t>
+            </w:r>
+          </w:p>
+        </w:tc>
+        <w:tc>
+          <w:tcPr>
+            <w:tcW w:type="dxa" w:w="3360"/>
+          </w:tcPr>
+          <w:p>
+            <w:pPr>
+              <w:keepNext/>
+            </w:pPr>
+            <w:r>
+              <w:rPr>
+                <w:sz w:val="18"/>
+              </w:rPr>
+              <w:t>paper status.json</w:t>
+            </w:r>
+          </w:p>
+        </w:tc>
+      </w:tr>
+      <w:tr>
+        <w:tc>
+          <w:tcPr>
+            <w:tcW w:type="dxa" w:w="3360"/>
+          </w:tcPr>
+          <w:p>
+            <w:pPr>
+              <w:keepNext/>
+            </w:pPr>
+            <w:r>
+              <w:rPr>
+                <w:sz w:val="18"/>
+              </w:rPr>
+              <w:t>served inputs with SHA-256 recorded</w:t>
+            </w:r>
+          </w:p>
+        </w:tc>
+        <w:tc>
+          <w:tcPr>
+            <w:tcW w:type="dxa" w:w="3360"/>
+          </w:tcPr>
+          <w:p>
+            <w:pPr>
+              <w:keepNext/>
+            </w:pPr>
+            <w:r>
+              <w:rPr>
+                <w:sz w:val="18"/>
+              </w:rPr>
+              <w:t>21/21 files</w:t>
+            </w:r>
+          </w:p>
+        </w:tc>
+        <w:tc>
+          <w:tcPr>
+            <w:tcW w:type="dxa" w:w="3360"/>
+          </w:tcPr>
+          <w:p>
+            <w:pPr>
+              <w:keepNext/>
+            </w:pPr>
+            <w:r>
+              <w:rPr>
+                <w:sz w:val="18"/>
+              </w:rPr>
+              <w:t>frozen target packages and retrieval ledger (10 attempted papers)</w:t>
+            </w:r>
+          </w:p>
+        </w:tc>
+      </w:tr>
+      <w:tr>
+        <w:tc>
+          <w:tcPr>
+            <w:tcW w:type="dxa" w:w="3360"/>
+          </w:tcPr>
+          <w:p>
+            <w:pPr>
+              <w:keepNext/>
+            </w:pPr>
+            <w:r>
+              <w:rPr>
+                <w:sz w:val="18"/>
+              </w:rPr>
+              <w:t>served inputs with retrieval timestamp recorded</w:t>
+            </w:r>
+          </w:p>
+        </w:tc>
+        <w:tc>
+          <w:tcPr>
+            <w:tcW w:type="dxa" w:w="3360"/>
+          </w:tcPr>
+          <w:p>
+            <w:pPr>
+              <w:keepNext/>
+            </w:pPr>
+            <w:r>
+              <w:rPr>
+                <w:sz w:val="18"/>
+              </w:rPr>
+              <w:t>21/21 files</w:t>
+            </w:r>
+          </w:p>
+        </w:tc>
+        <w:tc>
+          <w:tcPr>
+            <w:tcW w:type="dxa" w:w="3360"/>
+          </w:tcPr>
+          <w:p>
+            <w:pPr>
+              <w:keepNext/>
+            </w:pPr>
+            <w:r>
+              <w:rPr>
+                <w:sz w:val="18"/>
+              </w:rPr>
+              <w:t>frozen target packages and retrieval ledger (10 attempted papers)</w:t>
+            </w:r>
+          </w:p>
+        </w:tc>
+      </w:tr>
+      <w:tr>
+        <w:tc>
+          <w:tcPr>
+            <w:tcW w:type="dxa" w:w="3360"/>
+          </w:tcPr>
+          <w:p>
+            <w:pPr>
+              <w:keepNext/>
+            </w:pPr>
+            <w:r>
+              <w:rPr>
+                <w:sz w:val="18"/>
+              </w:rPr>
+              <w:t>served inputs with repository-announced checksum</w:t>
+            </w:r>
+          </w:p>
+        </w:tc>
+        <w:tc>
+          <w:tcPr>
+            <w:tcW w:type="dxa" w:w="3360"/>
+          </w:tcPr>
+          <w:p>
+            <w:pPr>
+              <w:keepNext/>
+            </w:pPr>
+            <w:r>
+              <w:rPr>
+                <w:sz w:val="18"/>
+              </w:rPr>
+              <w:t>7/21 files; 7 matched</w:t>
+            </w:r>
+          </w:p>
+        </w:tc>
+        <w:tc>
+          <w:tcPr>
+            <w:tcW w:type="dxa" w:w="3360"/>
+          </w:tcPr>
+          <w:p>
+            <w:pPr>
+              <w:keepNext/>
+            </w:pPr>
+            <w:r>
+              <w:rPr>
+                <w:sz w:val="18"/>
+              </w:rPr>
+              <w:t>frozen target packages and retrieval ledger (10 attempted papers)</w:t>
+            </w:r>
+          </w:p>
+        </w:tc>
+      </w:tr>
+      <w:tr>
+        <w:tc>
+          <w:tcPr>
+            <w:tcW w:type="dxa" w:w="3360"/>
+          </w:tcPr>
+          <w:p>
+            <w:pPr>
+              <w:keepNext/>
+            </w:pPr>
+            <w:r>
+              <w:rPr>
+                <w:sz w:val="18"/>
+              </w:rPr>
+              <w:t>repository version/release identifier of served inputs</w:t>
+            </w:r>
+          </w:p>
+        </w:tc>
+        <w:tc>
+          <w:tcPr>
+            <w:tcW w:type="dxa" w:w="3360"/>
+          </w:tcPr>
+          <w:p>
+            <w:pPr>
+              <w:keepNext/>
+            </w:pPr>
+            <w:r>
+              <w:rPr>
+                <w:sz w:val="18"/>
+              </w:rPr>
+              <w:t>not recorded (live service snapshots)</w:t>
+            </w:r>
+          </w:p>
+        </w:tc>
+        <w:tc>
+          <w:tcPr>
+            <w:tcW w:type="dxa" w:w="3360"/>
+          </w:tcPr>
+          <w:p>
+            <w:pPr>
+              <w:keepNext/>
+            </w:pPr>
+            <w:r>
+              <w:rPr>
+                <w:sz w:val="18"/>
+              </w:rPr>
+              <w:t>frozen target packages and retrieval ledger (10 attempted papers)</w:t>
+            </w:r>
+          </w:p>
+        </w:tc>
+      </w:tr>
+      <w:tr>
+        <w:tc>
+          <w:tcPr>
+            <w:tcW w:type="dxa" w:w="3360"/>
+          </w:tcPr>
+          <w:p>
+            <w:pPr>
+              <w:keepNext/>
+            </w:pPr>
+            <w:r>
+              <w:rPr>
+                <w:sz w:val="18"/>
+              </w:rPr>
+              <w:t>query/API parameters</w:t>
+            </w:r>
+          </w:p>
+        </w:tc>
+        <w:tc>
+          <w:tcPr>
+            <w:tcW w:type="dxa" w:w="3360"/>
+          </w:tcPr>
+          <w:p>
+            <w:pPr>
+              <w:keepNext/>
+            </w:pPr>
+            <w:r>
+              <w:rPr>
+                <w:sz w:val="18"/>
+              </w:rPr>
+              <w:t>anonymous GET of listed files; no query-generated input</w:t>
+            </w:r>
+          </w:p>
+        </w:tc>
+        <w:tc>
+          <w:tcPr>
+            <w:tcW w:type="dxa" w:w="3360"/>
+          </w:tcPr>
+          <w:p>
+            <w:pPr>
+              <w:keepNext/>
+            </w:pPr>
+            <w:r>
+              <w:rPr>
+                <w:sz w:val="18"/>
+              </w:rPr>
+              <w:t>frozen target packages and retrieval ledger (10 attempted papers)</w:t>
+            </w:r>
+          </w:p>
+        </w:tc>
+      </w:tr>
+      <w:tr>
+        <w:tc>
+          <w:tcPr>
+            <w:tcW w:type="dxa" w:w="3360"/>
+          </w:tcPr>
+          <w:p>
+            <w:pPr>
+              <w:keepNext/>
+            </w:pPr>
+            <w:r>
+              <w:rPr>
+                <w:sz w:val="18"/>
+              </w:rPr>
+              <w:t>schema/release identifier</w:t>
+            </w:r>
+          </w:p>
+        </w:tc>
+        <w:tc>
+          <w:tcPr>
+            <w:tcW w:type="dxa" w:w="3360"/>
+          </w:tcPr>
+          <w:p>
+            <w:pPr>
+              <w:keepNext/>
+            </w:pPr>
+            <w:r>
+              <w:rPr>
+                <w:sz w:val="18"/>
+              </w:rPr>
+              <w:t>not recorded</w:t>
+            </w:r>
+          </w:p>
+        </w:tc>
+        <w:tc>
+          <w:tcPr>
+            <w:tcW w:type="dxa" w:w="3360"/>
+          </w:tcPr>
+          <w:p>
+            <w:pPr>
+              <w:keepNext/>
+            </w:pPr>
+            <w:r>
+              <w:rPr>
+                <w:sz w:val="18"/>
+              </w:rPr>
+              <w:t>frozen target packages and retrieval ledger (10 attempted papers)</w:t>
+            </w:r>
+          </w:p>
+        </w:tc>
+      </w:tr>
+      <w:tr>
+        <w:tc>
+          <w:tcPr>
+            <w:tcW w:type="dxa" w:w="3360"/>
+          </w:tcPr>
+          <w:p>
+            <w:pPr>
+              <w:keepNext w:val="0"/>
+            </w:pPr>
+            <w:r>
+              <w:rPr>
+                <w:sz w:val="18"/>
+              </w:rPr>
+              <w:t>historical version check</w:t>
+            </w:r>
+          </w:p>
+        </w:tc>
+        <w:tc>
+          <w:tcPr>
+            <w:tcW w:type="dxa" w:w="3360"/>
+          </w:tcPr>
+          <w:p>
+            <w:pPr>
+              <w:keepNext w:val="0"/>
+            </w:pPr>
+            <w:r>
+              <w:rPr>
+                <w:sz w:val="18"/>
+              </w:rPr>
+              <w:t>not assessed</w:t>
+            </w:r>
+          </w:p>
+        </w:tc>
+        <w:tc>
+          <w:tcPr>
+            <w:tcW w:type="dxa" w:w="3360"/>
+          </w:tcPr>
+          <w:p>
+            <w:pPr>
+              <w:keepNext w:val="0"/>
+            </w:pPr>
+            <w:r>
+              <w:rPr>
+                <w:sz w:val="18"/>
+              </w:rPr>
+              <w:t>frozen target packages and retrieval ledger (10 attempted papers)</w:t>
             </w:r>
           </w:p>
         </w:tc>

</xml_diff>

<commit_message>
Revise Paper II manuscript package to completed-study language; clarify code availability; Section 4/5 framing; extend QC; add REVISION_CHANGELOG
Co-Authored-By: Tatsuki Onishi <bougtoir@gmail.com>
</commit_message>
<xml_diff>
--- a/paper2_reconstruction/manuscript/Editable_tables_EN.docx
+++ b/paper2_reconstruction/manuscript/Editable_tables_EN.docx
@@ -7671,7 +7671,7 @@
               <w:rPr>
                 <w:sz w:val="18"/>
               </w:rPr>
-              <w:t>ACCESS</w:t>
+              <w:t>ACCESS (artifact access)</w:t>
             </w:r>
           </w:p>
         </w:tc>
@@ -7687,7 +7687,7 @@
               <w:rPr>
                 <w:sz w:val="18"/>
               </w:rPr>
-              <w:t>locate the original implementation (not used in Paper II)</w:t>
+              <w:t>locate the original implementation; artifact reproducibility only, deliberately excluded from the Paper II blind intervention and used solely as a descriptive characteristic and post-seal reveal resource</w:t>
             </w:r>
           </w:p>
         </w:tc>
@@ -8379,7 +8379,7 @@
               <w:rPr>
                 <w:sz w:val="18"/>
               </w:rPr>
-              <w:t>reference version/release stated in publication text</w:t>
+              <w:t>reference version/release recorded by the specifier from publication text</w:t>
             </w:r>
           </w:p>
         </w:tc>
@@ -8429,7 +8429,7 @@
               <w:rPr>
                 <w:sz w:val="18"/>
               </w:rPr>
-              <w:t>reference version/release not specified</w:t>
+              <w:t>reference version/release not specified in publication text</w:t>
             </w:r>
           </w:p>
         </w:tc>

</xml_diff>

<commit_message>
FINAL NON-HUMAN QC patch: S-numbering, numeric citations, OMML equations, asterisk/wrap cleanup
Co-Authored-By: Tatsuki Onishi <bougtoir@gmail.com>
</commit_message>
<xml_diff>
--- a/paper2_reconstruction/manuscript/Editable_tables_EN.docx
+++ b/paper2_reconstruction/manuscript/Editable_tables_EN.docx
@@ -12,7 +12,7 @@
     </w:p>
     <w:p>
       <w:r>
-        <w:t>Table 1 is the observed source audit; Table S1 is analytic planning only.</w:t>
+        <w:t>Table 1 is the observed source audit; Table S11 is analytic planning only.</w:t>
       </w:r>
     </w:p>
     <w:p>
@@ -448,7 +448,7 @@
         <w:rPr>
           <w:i/>
         </w:rPr>
-        <w:t>Table 2. Main-cohort paper dispositions (delegated; human adjudication pending).</w:t>
+        <w:t>Table S3. Main-cohort paper dispositions (delegated; human adjudication pending).</w:t>
       </w:r>
     </w:p>
     <w:tbl>
@@ -777,7 +777,7 @@
         <w:rPr>
           <w:i/>
         </w:rPr>
-        <w:t>Table 3. Run-level L1–L5 states across 30 sealed slots.</w:t>
+        <w:t>Table S4. Run-level L1–L5 states across 30 sealed slots.</w:t>
       </w:r>
     </w:p>
     <w:tbl>
@@ -1451,7 +1451,7 @@
         <w:rPr>
           <w:i/>
         </w:rPr>
-        <w:t>Table 4. Failure taxonomy codes by run and by paper.</w:t>
+        <w:t>Table S5. Failure taxonomy codes by run and by paper.</w:t>
       </w:r>
     </w:p>
     <w:tbl>
@@ -1775,7 +1775,7 @@
         <w:rPr>
           <w:i/>
         </w:rPr>
-        <w:t>Table 5. Descriptive original-code reveal ledger (post-seal, not executed).</w:t>
+        <w:t>Table S6. Descriptive original-code reveal ledger (post-seal, not executed).</w:t>
       </w:r>
     </w:p>
     <w:tbl>
@@ -5641,7 +5641,7 @@
         <w:rPr>
           <w:i/>
         </w:rPr>
-        <w:t>Table 6. Paper-level successful-slot distribution among 10 attempted papers: frozen mechanical versus verification-adjusted (AI-assisted review, provisional).</w:t>
+        <w:t>Table S7. Paper-level successful-slot distribution among 10 attempted papers: frozen mechanical versus verification-adjusted (AI-assisted review, provisional).</w:t>
       </w:r>
     </w:p>
     <w:tbl>
@@ -5915,7 +5915,7 @@
         <w:rPr>
           <w:i/>
         </w:rPr>
-        <w:t>Table 7. 100-paper funnel by state: frozen record, verification-adjusted state and unresolved envelope (no reclassified paper was executed).</w:t>
+        <w:t>Table S8. 100-paper funnel by state: frozen record, verification-adjusted state and unresolved envelope (no reclassified paper was executed).</w:t>
       </w:r>
     </w:p>
     <w:tbl>
@@ -6666,7 +6666,7 @@
         <w:rPr>
           <w:i/>
         </w:rPr>
-        <w:t>Table 8. Descriptive reveal completeness corrections proposed by the E review (papers with a code route only; descriptive, not executed).</w:t>
+        <w:t>Table S9. Descriptive reveal completeness corrections proposed by the E review (papers with a code route only; descriptive, not executed).</w:t>
       </w:r>
     </w:p>
     <w:tbl>
@@ -7087,7 +7087,7 @@
         <w:rPr>
           <w:i/>
         </w:rPr>
-        <w:t>Table 9. Human validation (Section D): PENDING — no participant, case or outcome data exist.</w:t>
+        <w:t>Table S10. Human validation (Section D): PENDING — no participant, case or outcome data exist.</w:t>
       </w:r>
     </w:p>
     <w:tbl>
@@ -7178,7 +7178,7 @@
         <w:rPr>
           <w:i/>
         </w:rPr>
-        <w:t>Table 10. Conceptual mapping of reproducibility requirements to framework stages. ACCESS is refined into resource accessibility, input-state identifiability and historical-state retrievability; the mapping is conceptual, not an empirical result.</w:t>
+        <w:t>Table S1. Conceptual mapping of reproducibility requirements to framework stages. ACCESS is refined into resource accessibility, input-state identifiability and historical-state retrievability; the mapping is conceptual, not an empirical result.</w:t>
       </w:r>
     </w:p>
     <w:tbl>
@@ -8102,7 +8102,7 @@
         <w:rPr>
           <w:i/>
         </w:rPr>
-        <w:t>Table 11. ACCESS-stage input-state fields as recorded in the frozen main-study records (descriptive; fields not recorded are reported as such; no dataset drift was measured).</w:t>
+        <w:t>Table S2. ACCESS-stage input-state fields as recorded in the frozen main-study records (descriptive; fields not recorded are reported as such; no dataset drift was measured).</w:t>
       </w:r>
     </w:p>
     <w:tbl>
@@ -8876,7 +8876,7 @@
         <w:rPr>
           <w:i/>
         </w:rPr>
-        <w:t>Table S1. Analytic Wilson precision planning.</w:t>
+        <w:t>Table S11. Analytic Wilson precision planning.</w:t>
       </w:r>
     </w:p>
     <w:tbl>

</xml_diff>